<commit_message>
Update mission-vision-values brand doc
Co-Authored-By: Claude Sonnet 5 <noreply@anthropic.com>
</commit_message>
<xml_diff>
--- a/brand/mission-vision-values.docx
+++ b/brand/mission-vision-values.docx
@@ -1817,8 +1817,8 @@
 </file>
 
 <file path=customXml/item3.xml><?xml version="1.0" encoding="utf-8"?>
-<ct:contentTypeSchema xmlns:ct="http://schemas.microsoft.com/office/2006/metadata/contentType" xmlns:ma="http://schemas.microsoft.com/office/2006/metadata/properties/metaAttributes" ct:_="" ma:_="" ma:contentTypeName="Document" ma:contentTypeID="0x010100C1FE8554465F534FBFA49ED28B227626" ma:contentTypeVersion="15" ma:contentTypeDescription="Create a new document." ma:contentTypeScope="" ma:versionID="1881df44bf0f01ec4deb1c21174786b6">
-  <xsd:schema xmlns:xsd="http://www.w3.org/2001/XMLSchema" xmlns:xs="http://www.w3.org/2001/XMLSchema" xmlns:p="http://schemas.microsoft.com/office/2006/metadata/properties" xmlns:ns2="c609c7da-536b-487f-902f-cd339303c4c0" xmlns:ns3="cd95e00c-f33c-4e72-be1e-251c28aa1542" targetNamespace="http://schemas.microsoft.com/office/2006/metadata/properties" ma:root="true" ma:fieldsID="acf3b4a6063652ba333df112cae6e25f" ns2:_="" ns3:_="">
+<ct:contentTypeSchema xmlns:ct="http://schemas.microsoft.com/office/2006/metadata/contentType" xmlns:ma="http://schemas.microsoft.com/office/2006/metadata/properties/metaAttributes" ct:_="" ma:_="" ma:contentTypeName="Document" ma:contentTypeID="0x010100C1FE8554465F534FBFA49ED28B227626" ma:contentTypeVersion="16" ma:contentTypeDescription="Create a new document." ma:contentTypeScope="" ma:versionID="771ec8ca2122e2ce46513461f2b6886e">
+  <xsd:schema xmlns:xsd="http://www.w3.org/2001/XMLSchema" xmlns:xs="http://www.w3.org/2001/XMLSchema" xmlns:p="http://schemas.microsoft.com/office/2006/metadata/properties" xmlns:ns2="c609c7da-536b-487f-902f-cd339303c4c0" xmlns:ns3="cd95e00c-f33c-4e72-be1e-251c28aa1542" targetNamespace="http://schemas.microsoft.com/office/2006/metadata/properties" ma:root="true" ma:fieldsID="97f8f2e9ce66d11d26b3e6146e47a1d1" ns2:_="" ns3:_="">
     <xsd:import namespace="c609c7da-536b-487f-902f-cd339303c4c0"/>
     <xsd:import namespace="cd95e00c-f33c-4e72-be1e-251c28aa1542"/>
     <xsd:element name="properties">
@@ -1841,6 +1841,7 @@
                 <xsd:element ref="ns3:MediaLengthInSeconds" minOccurs="0"/>
                 <xsd:element ref="ns3:MediaServiceSearchProperties" minOccurs="0"/>
                 <xsd:element ref="ns3:MediaServiceLocation" minOccurs="0"/>
+                <xsd:element ref="ns3:MediaServiceBillingMetadata" minOccurs="0"/>
               </xsd:all>
             </xsd:complexType>
           </xsd:element>
@@ -1949,6 +1950,11 @@
     <xsd:element name="MediaServiceLocation" ma:index="22" nillable="true" ma:displayName="Location" ma:indexed="true" ma:internalName="MediaServiceLocation" ma:readOnly="true">
       <xsd:simpleType>
         <xsd:restriction base="dms:Text"/>
+      </xsd:simpleType>
+    </xsd:element>
+    <xsd:element name="MediaServiceBillingMetadata" ma:index="23" nillable="true" ma:displayName="MediaServiceBillingMetadata" ma:hidden="true" ma:internalName="MediaServiceBillingMetadata" ma:readOnly="true">
+      <xsd:simpleType>
+        <xsd:restriction base="dms:Note"/>
       </xsd:simpleType>
     </xsd:element>
   </xsd:schema>
@@ -2071,20 +2077,5 @@
 </file>
 
 <file path=customXml/itemProps3.xml><?xml version="1.0" encoding="utf-8"?>
-<ds:datastoreItem xmlns:ds="http://schemas.openxmlformats.org/officeDocument/2006/customXml" ds:itemID="{B687D7C7-F431-46FE-9B29-3018801210C4}">
-  <ds:schemaRefs>
-    <ds:schemaRef ds:uri="http://schemas.microsoft.com/office/2006/metadata/contentType"/>
-    <ds:schemaRef ds:uri="http://schemas.microsoft.com/office/2006/metadata/properties/metaAttributes"/>
-    <ds:schemaRef ds:uri="http://www.w3.org/2001/XMLSchema"/>
-    <ds:schemaRef ds:uri="http://schemas.microsoft.com/office/2006/metadata/properties"/>
-    <ds:schemaRef ds:uri="c609c7da-536b-487f-902f-cd339303c4c0"/>
-    <ds:schemaRef ds:uri="cd95e00c-f33c-4e72-be1e-251c28aa1542"/>
-    <ds:schemaRef ds:uri="http://schemas.microsoft.com/office/2006/documentManagement/types"/>
-    <ds:schemaRef ds:uri="http://schemas.microsoft.com/office/infopath/2007/PartnerControls"/>
-    <ds:schemaRef ds:uri="http://schemas.openxmlformats.org/package/2006/metadata/core-properties"/>
-    <ds:schemaRef ds:uri="http://purl.org/dc/elements/1.1/"/>
-    <ds:schemaRef ds:uri="http://purl.org/dc/terms/"/>
-    <ds:schemaRef ds:uri="http://schemas.microsoft.com/internal/obd"/>
-  </ds:schemaRefs>
-</ds:datastoreItem>
+<ds:datastoreItem xmlns:ds="http://schemas.openxmlformats.org/officeDocument/2006/customXml" ds:itemID="{FEDD4B97-C79A-4C55-A347-280E310CEDAA}"/>
 </file>
</xml_diff>